<commit_message>
Add Module 1.3 assignment files
</commit_message>
<xml_diff>
--- a/module-1/Xiong-Assignment1_2.docx
+++ b/module-1/Xiong-Assignment1_2.docx
@@ -2,6 +2,29 @@
 <file path=word/document.xml><?xml version="1.0" encoding="utf-8"?>
 <w:document xmlns:wpc="http://schemas.microsoft.com/office/word/2010/wordprocessingCanvas" xmlns:cx="http://schemas.microsoft.com/office/drawing/2014/chartex" xmlns:cx1="http://schemas.microsoft.com/office/drawing/2015/9/8/chartex" xmlns:cx2="http://schemas.microsoft.com/office/drawing/2015/10/21/chartex" xmlns:cx3="http://schemas.microsoft.com/office/drawing/2016/5/9/chartex" xmlns:cx4="http://schemas.microsoft.com/office/drawing/2016/5/10/chartex" xmlns:cx5="http://schemas.microsoft.com/office/drawing/2016/5/11/chartex" xmlns:cx6="http://schemas.microsoft.com/office/drawing/2016/5/12/chartex" xmlns:cx7="http://schemas.microsoft.com/office/drawing/2016/5/13/chartex" xmlns:cx8="http://schemas.microsoft.com/office/drawing/2016/5/14/chartex" xmlns:mc="http://schemas.openxmlformats.org/markup-compatibility/2006" xmlns:m="http://schemas.openxmlformats.org/officeDocument/2006/math" xmlns:aink="http://schemas.microsoft.com/office/drawing/2016/ink" xmlns:am3d="http://schemas.microsoft.com/office/drawing/2017/model3d" xmlns:oel="http://schemas.microsoft.com/office/2019/extlst" xmlns:r="http://schemas.openxmlformats.org/officeDocument/2006/relationships" xmlns:wp14="http://schemas.microsoft.com/office/word/2010/wordprocessingDrawing" xmlns:wp="http://schemas.openxmlformats.org/drawingml/2006/wordprocessingDrawing" xmlns:wpg="http://schemas.microsoft.com/office/word/2010/wordprocessingGroup" xmlns:wpi="http://schemas.microsoft.com/office/word/2010/wordprocessingInk" xmlns:wps="http://schemas.microsoft.com/office/word/2010/wordprocessingShape" xmlns:o="urn:schemas-microsoft-com:office:office" xmlns:v="urn:schemas-microsoft-com:vml" xmlns:w10="urn:schemas-microsoft-com:office:word" xmlns:w="http://schemas.openxmlformats.org/wordprocessingml/2006/main" xmlns:w14="http://schemas.microsoft.com/office/word/2010/wordml" xmlns:w15="http://schemas.microsoft.com/office/word/2012/wordml" xmlns:w16cex="http://schemas.microsoft.com/office/word/2018/wordml/cex" xmlns:w16cid="http://schemas.microsoft.com/office/word/2016/wordml/cid" xmlns:w16="http://schemas.microsoft.com/office/word/2018/wordml" xmlns:w16sdtdh="http://schemas.microsoft.com/office/word/2020/wordml/sdtdatahash" xmlns:w16sdtfl="http://schemas.microsoft.com/office/word/2024/wordml/sdtformatlock" xmlns:w16se="http://schemas.microsoft.com/office/word/2015/wordml/symex" xmlns:w16du="http://schemas.microsoft.com/office/word/2023/wordml/word16du" xmlns:wne="http://schemas.microsoft.com/office/word/2006/wordml" mc:Ignorable="w14 w15 w16se w16cid w16 w16cex w16sdtdh w16sdtfl w16du wp14">
   <w:body>
+    <w:p/>
+    <w:p>
+      <w:pPr>
+        <w:jc w:val="center"/>
+      </w:pPr>
+      <w:r>
+        <w:t>Module 1.2 Assignment</w:t>
+      </w:r>
+    </w:p>
+    <w:p>
+      <w:pPr>
+        <w:jc w:val="center"/>
+      </w:pPr>
+    </w:p>
+    <w:p>
+      <w:pPr>
+        <w:jc w:val="center"/>
+      </w:pPr>
+      <w:r>
+        <w:t>https://github.com/joshuaxiong24/csd-325</w:t>
+      </w:r>
+    </w:p>
+    <w:p/>
     <w:p>
       <w:r>
         <w:drawing>
@@ -20,7 +43,7 @@
                     <pic:cNvPicPr/>
                   </pic:nvPicPr>
                   <pic:blipFill>
-                    <a:blip r:embed="rId4"/>
+                    <a:blip r:embed="rId6"/>
                     <a:stretch>
                       <a:fillRect/>
                     </a:stretch>
@@ -41,7 +64,86 @@
         </w:drawing>
       </w:r>
     </w:p>
+    <w:p/>
+    <w:p>
+      <w:r>
+        <w:lastRenderedPageBreak/>
+        <w:drawing>
+          <wp:inline distT="0" distB="0" distL="0" distR="0" wp14:anchorId="0DD6EC6B" wp14:editId="3A979880">
+            <wp:extent cx="5943600" cy="3213735"/>
+            <wp:effectExtent l="0" t="0" r="0" b="0"/>
+            <wp:docPr id="800675939" name="Picture 1"/>
+            <wp:cNvGraphicFramePr>
+              <a:graphicFrameLocks xmlns:a="http://schemas.openxmlformats.org/drawingml/2006/main" noChangeAspect="1"/>
+            </wp:cNvGraphicFramePr>
+            <a:graphic xmlns:a="http://schemas.openxmlformats.org/drawingml/2006/main">
+              <a:graphicData uri="http://schemas.openxmlformats.org/drawingml/2006/picture">
+                <pic:pic xmlns:pic="http://schemas.openxmlformats.org/drawingml/2006/picture">
+                  <pic:nvPicPr>
+                    <pic:cNvPr id="800675939" name=""/>
+                    <pic:cNvPicPr/>
+                  </pic:nvPicPr>
+                  <pic:blipFill>
+                    <a:blip r:embed="rId7"/>
+                    <a:stretch>
+                      <a:fillRect/>
+                    </a:stretch>
+                  </pic:blipFill>
+                  <pic:spPr>
+                    <a:xfrm>
+                      <a:off x="0" y="0"/>
+                      <a:ext cx="5943600" cy="3213735"/>
+                    </a:xfrm>
+                    <a:prstGeom prst="rect">
+                      <a:avLst/>
+                    </a:prstGeom>
+                  </pic:spPr>
+                </pic:pic>
+              </a:graphicData>
+            </a:graphic>
+          </wp:inline>
+        </w:drawing>
+      </w:r>
+      <w:r>
+        <w:drawing>
+          <wp:inline distT="0" distB="0" distL="0" distR="0" wp14:anchorId="6444E7C3" wp14:editId="16DF4BD8">
+            <wp:extent cx="5943600" cy="3373755"/>
+            <wp:effectExtent l="0" t="0" r="0" b="4445"/>
+            <wp:docPr id="1516380725" name="Picture 1"/>
+            <wp:cNvGraphicFramePr>
+              <a:graphicFrameLocks xmlns:a="http://schemas.openxmlformats.org/drawingml/2006/main" noChangeAspect="1"/>
+            </wp:cNvGraphicFramePr>
+            <a:graphic xmlns:a="http://schemas.openxmlformats.org/drawingml/2006/main">
+              <a:graphicData uri="http://schemas.openxmlformats.org/drawingml/2006/picture">
+                <pic:pic xmlns:pic="http://schemas.openxmlformats.org/drawingml/2006/picture">
+                  <pic:nvPicPr>
+                    <pic:cNvPr id="1516380725" name=""/>
+                    <pic:cNvPicPr/>
+                  </pic:nvPicPr>
+                  <pic:blipFill>
+                    <a:blip r:embed="rId8"/>
+                    <a:stretch>
+                      <a:fillRect/>
+                    </a:stretch>
+                  </pic:blipFill>
+                  <pic:spPr>
+                    <a:xfrm>
+                      <a:off x="0" y="0"/>
+                      <a:ext cx="5943600" cy="3373755"/>
+                    </a:xfrm>
+                    <a:prstGeom prst="rect">
+                      <a:avLst/>
+                    </a:prstGeom>
+                  </pic:spPr>
+                </pic:pic>
+              </a:graphicData>
+            </a:graphic>
+          </wp:inline>
+        </w:drawing>
+      </w:r>
+    </w:p>
     <w:sectPr>
+      <w:headerReference w:type="default" r:id="rId9"/>
       <w:pgSz w:w="12240" w:h="15840"/>
       <w:pgMar w:top="1440" w:right="1440" w:bottom="1440" w:left="1440" w:header="720" w:footer="720" w:gutter="0"/>
       <w:cols w:space="720"/>
@@ -49,6 +151,125 @@
     </w:sectPr>
   </w:body>
 </w:document>
+</file>
+
+<file path=word/endnotes.xml><?xml version="1.0" encoding="utf-8"?>
+<w:endnotes xmlns:wpc="http://schemas.microsoft.com/office/word/2010/wordprocessingCanvas" xmlns:cx="http://schemas.microsoft.com/office/drawing/2014/chartex" xmlns:cx1="http://schemas.microsoft.com/office/drawing/2015/9/8/chartex" xmlns:cx2="http://schemas.microsoft.com/office/drawing/2015/10/21/chartex" xmlns:cx3="http://schemas.microsoft.com/office/drawing/2016/5/9/chartex" xmlns:cx4="http://schemas.microsoft.com/office/drawing/2016/5/10/chartex" xmlns:cx5="http://schemas.microsoft.com/office/drawing/2016/5/11/chartex" xmlns:cx6="http://schemas.microsoft.com/office/drawing/2016/5/12/chartex" xmlns:cx7="http://schemas.microsoft.com/office/drawing/2016/5/13/chartex" xmlns:cx8="http://schemas.microsoft.com/office/drawing/2016/5/14/chartex" xmlns:mc="http://schemas.openxmlformats.org/markup-compatibility/2006" xmlns:m="http://schemas.openxmlformats.org/officeDocument/2006/math" xmlns:aink="http://schemas.microsoft.com/office/drawing/2016/ink" xmlns:am3d="http://schemas.microsoft.com/office/drawing/2017/model3d" xmlns:oel="http://schemas.microsoft.com/office/2019/extlst" xmlns:r="http://schemas.openxmlformats.org/officeDocument/2006/relationships" xmlns:wp14="http://schemas.microsoft.com/office/word/2010/wordprocessingDrawing" xmlns:wp="http://schemas.openxmlformats.org/drawingml/2006/wordprocessingDrawing" xmlns:wpg="http://schemas.microsoft.com/office/word/2010/wordprocessingGroup" xmlns:wpi="http://schemas.microsoft.com/office/word/2010/wordprocessingInk" xmlns:wps="http://schemas.microsoft.com/office/word/2010/wordprocessingShape" xmlns:o="urn:schemas-microsoft-com:office:office" xmlns:v="urn:schemas-microsoft-com:vml" xmlns:w10="urn:schemas-microsoft-com:office:word" xmlns:w="http://schemas.openxmlformats.org/wordprocessingml/2006/main" xmlns:w14="http://schemas.microsoft.com/office/word/2010/wordml" xmlns:w15="http://schemas.microsoft.com/office/word/2012/wordml" xmlns:w16cex="http://schemas.microsoft.com/office/word/2018/wordml/cex" xmlns:w16cid="http://schemas.microsoft.com/office/word/2016/wordml/cid" xmlns:w16="http://schemas.microsoft.com/office/word/2018/wordml" xmlns:w16sdtdh="http://schemas.microsoft.com/office/word/2020/wordml/sdtdatahash" xmlns:w16sdtfl="http://schemas.microsoft.com/office/word/2024/wordml/sdtformatlock" xmlns:w16se="http://schemas.microsoft.com/office/word/2015/wordml/symex" xmlns:w16du="http://schemas.microsoft.com/office/word/2023/wordml/word16du" xmlns:wne="http://schemas.microsoft.com/office/word/2006/wordml" mc:Ignorable="w14 w15 w16se w16cid w16 w16cex w16sdtdh w16sdtfl w16du wp14">
+  <w:endnote w:type="separator" w:id="-1">
+    <w:p>
+      <w:pPr>
+        <w:spacing w:after="0" w:line="240" w:lineRule="auto"/>
+      </w:pPr>
+      <w:r>
+        <w:separator/>
+      </w:r>
+    </w:p>
+  </w:endnote>
+  <w:endnote w:type="continuationSeparator" w:id="0">
+    <w:p>
+      <w:pPr>
+        <w:spacing w:after="0" w:line="240" w:lineRule="auto"/>
+      </w:pPr>
+      <w:r>
+        <w:continuationSeparator/>
+      </w:r>
+    </w:p>
+  </w:endnote>
+</w:endnotes>
+</file>
+
+<file path=word/footnotes.xml><?xml version="1.0" encoding="utf-8"?>
+<w:footnotes xmlns:wpc="http://schemas.microsoft.com/office/word/2010/wordprocessingCanvas" xmlns:cx="http://schemas.microsoft.com/office/drawing/2014/chartex" xmlns:cx1="http://schemas.microsoft.com/office/drawing/2015/9/8/chartex" xmlns:cx2="http://schemas.microsoft.com/office/drawing/2015/10/21/chartex" xmlns:cx3="http://schemas.microsoft.com/office/drawing/2016/5/9/chartex" xmlns:cx4="http://schemas.microsoft.com/office/drawing/2016/5/10/chartex" xmlns:cx5="http://schemas.microsoft.com/office/drawing/2016/5/11/chartex" xmlns:cx6="http://schemas.microsoft.com/office/drawing/2016/5/12/chartex" xmlns:cx7="http://schemas.microsoft.com/office/drawing/2016/5/13/chartex" xmlns:cx8="http://schemas.microsoft.com/office/drawing/2016/5/14/chartex" xmlns:mc="http://schemas.openxmlformats.org/markup-compatibility/2006" xmlns:m="http://schemas.openxmlformats.org/officeDocument/2006/math" xmlns:aink="http://schemas.microsoft.com/office/drawing/2016/ink" xmlns:am3d="http://schemas.microsoft.com/office/drawing/2017/model3d" xmlns:oel="http://schemas.microsoft.com/office/2019/extlst" xmlns:r="http://schemas.openxmlformats.org/officeDocument/2006/relationships" xmlns:wp14="http://schemas.microsoft.com/office/word/2010/wordprocessingDrawing" xmlns:wp="http://schemas.openxmlformats.org/drawingml/2006/wordprocessingDrawing" xmlns:wpg="http://schemas.microsoft.com/office/word/2010/wordprocessingGroup" xmlns:wpi="http://schemas.microsoft.com/office/word/2010/wordprocessingInk" xmlns:wps="http://schemas.microsoft.com/office/word/2010/wordprocessingShape" xmlns:o="urn:schemas-microsoft-com:office:office" xmlns:v="urn:schemas-microsoft-com:vml" xmlns:w10="urn:schemas-microsoft-com:office:word" xmlns:w="http://schemas.openxmlformats.org/wordprocessingml/2006/main" xmlns:w14="http://schemas.microsoft.com/office/word/2010/wordml" xmlns:w15="http://schemas.microsoft.com/office/word/2012/wordml" xmlns:w16cex="http://schemas.microsoft.com/office/word/2018/wordml/cex" xmlns:w16cid="http://schemas.microsoft.com/office/word/2016/wordml/cid" xmlns:w16="http://schemas.microsoft.com/office/word/2018/wordml" xmlns:w16sdtdh="http://schemas.microsoft.com/office/word/2020/wordml/sdtdatahash" xmlns:w16sdtfl="http://schemas.microsoft.com/office/word/2024/wordml/sdtformatlock" xmlns:w16se="http://schemas.microsoft.com/office/word/2015/wordml/symex" xmlns:w16du="http://schemas.microsoft.com/office/word/2023/wordml/word16du" xmlns:wne="http://schemas.microsoft.com/office/word/2006/wordml" mc:Ignorable="w14 w15 w16se w16cid w16 w16cex w16sdtdh w16sdtfl w16du wp14">
+  <w:footnote w:type="separator" w:id="-1">
+    <w:p>
+      <w:pPr>
+        <w:spacing w:after="0" w:line="240" w:lineRule="auto"/>
+      </w:pPr>
+      <w:r>
+        <w:separator/>
+      </w:r>
+    </w:p>
+  </w:footnote>
+  <w:footnote w:type="continuationSeparator" w:id="0">
+    <w:p>
+      <w:pPr>
+        <w:spacing w:after="0" w:line="240" w:lineRule="auto"/>
+      </w:pPr>
+      <w:r>
+        <w:continuationSeparator/>
+      </w:r>
+    </w:p>
+  </w:footnote>
+</w:footnotes>
+</file>
+
+<file path=word/header1.xml><?xml version="1.0" encoding="utf-8"?>
+<w:hdr xmlns:wpc="http://schemas.microsoft.com/office/word/2010/wordprocessingCanvas" xmlns:cx="http://schemas.microsoft.com/office/drawing/2014/chartex" xmlns:cx1="http://schemas.microsoft.com/office/drawing/2015/9/8/chartex" xmlns:cx2="http://schemas.microsoft.com/office/drawing/2015/10/21/chartex" xmlns:cx3="http://schemas.microsoft.com/office/drawing/2016/5/9/chartex" xmlns:cx4="http://schemas.microsoft.com/office/drawing/2016/5/10/chartex" xmlns:cx5="http://schemas.microsoft.com/office/drawing/2016/5/11/chartex" xmlns:cx6="http://schemas.microsoft.com/office/drawing/2016/5/12/chartex" xmlns:cx7="http://schemas.microsoft.com/office/drawing/2016/5/13/chartex" xmlns:cx8="http://schemas.microsoft.com/office/drawing/2016/5/14/chartex" xmlns:mc="http://schemas.openxmlformats.org/markup-compatibility/2006" xmlns:m="http://schemas.openxmlformats.org/officeDocument/2006/math" xmlns:aink="http://schemas.microsoft.com/office/drawing/2016/ink" xmlns:am3d="http://schemas.microsoft.com/office/drawing/2017/model3d" xmlns:oel="http://schemas.microsoft.com/office/2019/extlst" xmlns:r="http://schemas.openxmlformats.org/officeDocument/2006/relationships" xmlns:wp14="http://schemas.microsoft.com/office/word/2010/wordprocessingDrawing" xmlns:wp="http://schemas.openxmlformats.org/drawingml/2006/wordprocessingDrawing" xmlns:wpg="http://schemas.microsoft.com/office/word/2010/wordprocessingGroup" xmlns:wpi="http://schemas.microsoft.com/office/word/2010/wordprocessingInk" xmlns:wps="http://schemas.microsoft.com/office/word/2010/wordprocessingShape" xmlns:o="urn:schemas-microsoft-com:office:office" xmlns:v="urn:schemas-microsoft-com:vml" xmlns:w10="urn:schemas-microsoft-com:office:word" xmlns:w="http://schemas.openxmlformats.org/wordprocessingml/2006/main" xmlns:w14="http://schemas.microsoft.com/office/word/2010/wordml" xmlns:w15="http://schemas.microsoft.com/office/word/2012/wordml" xmlns:w16cex="http://schemas.microsoft.com/office/word/2018/wordml/cex" xmlns:w16cid="http://schemas.microsoft.com/office/word/2016/wordml/cid" xmlns:w16="http://schemas.microsoft.com/office/word/2018/wordml" xmlns:w16sdtdh="http://schemas.microsoft.com/office/word/2020/wordml/sdtdatahash" xmlns:w16sdtfl="http://schemas.microsoft.com/office/word/2024/wordml/sdtformatlock" xmlns:w16se="http://schemas.microsoft.com/office/word/2015/wordml/symex" xmlns:w16du="http://schemas.microsoft.com/office/word/2023/wordml/word16du" xmlns:wne="http://schemas.microsoft.com/office/word/2006/wordml" mc:Ignorable="w14 w15 w16se w16cid w16 w16cex w16sdtdh w16sdtfl w16du wp14">
+  <w:p>
+    <w:pPr>
+      <w:pStyle w:val="Header"/>
+      <w:jc w:val="right"/>
+    </w:pPr>
+    <w:r>
+      <w:t>Joshua Xiong</w:t>
+    </w:r>
+  </w:p>
+  <w:p>
+    <w:pPr>
+      <w:spacing w:after="0" w:line="240" w:lineRule="auto"/>
+      <w:jc w:val="right"/>
+      <w:outlineLvl w:val="0"/>
+      <w:rPr>
+        <w:rFonts w:eastAsia="Times New Roman" w:cs="Open Sans"/>
+        <w:kern w:val="36"/>
+        <w14:ligatures w14:val="none"/>
+      </w:rPr>
+    </w:pPr>
+    <w:r>
+      <w:rPr>
+        <w:rFonts w:eastAsia="Times New Roman" w:cs="Open Sans"/>
+        <w:kern w:val="36"/>
+        <w14:ligatures w14:val="none"/>
+      </w:rPr>
+      <w:t>CSD325-309A Advanced Python (2271-DD)</w:t>
+    </w:r>
+  </w:p>
+  <w:p>
+    <w:pPr>
+      <w:pStyle w:val="Header"/>
+      <w:jc w:val="right"/>
+    </w:pPr>
+    <w:r>
+      <w:rPr>
+        <w:rFonts w:eastAsia="Open Sans" w:cs="Open Sans"/>
+      </w:rPr>
+      <w:t>October 24</w:t>
+    </w:r>
+    <w:r>
+      <w:rPr>
+        <w:rFonts w:eastAsia="Open Sans" w:cs="Open Sans"/>
+        <w:vertAlign w:val="superscript"/>
+      </w:rPr>
+      <w:t>th</w:t>
+    </w:r>
+    <w:r>
+      <w:rPr>
+        <w:rFonts w:eastAsia="Open Sans" w:cs="Open Sans"/>
+      </w:rPr>
+      <w:t>, 2026</w:t>
+    </w:r>
+  </w:p>
+  <w:p>
+    <w:pPr>
+      <w:pStyle w:val="Header"/>
+    </w:pPr>
+  </w:p>
+  <w:p>
+    <w:pPr>
+      <w:pStyle w:val="Header"/>
+    </w:pPr>
+  </w:p>
+</w:hdr>
 </file>
 
 <file path=word/styles.xml><?xml version="1.0" encoding="utf-8"?>
@@ -971,6 +1192,50 @@
       <w:spacing w:val="5"/>
     </w:rPr>
   </w:style>
+  <w:style w:type="paragraph" w:styleId="Header">
+    <w:name w:val="header"/>
+    <w:basedOn w:val="Normal"/>
+    <w:link w:val="HeaderChar"/>
+    <w:uiPriority w:val="99"/>
+    <w:unhideWhenUsed/>
+    <w:rsid w:val="0098673C"/>
+    <w:pPr>
+      <w:tabs>
+        <w:tab w:val="center" w:pos="4680"/>
+        <w:tab w:val="right" w:pos="9360"/>
+      </w:tabs>
+      <w:spacing w:after="0" w:line="240" w:lineRule="auto"/>
+    </w:pPr>
+  </w:style>
+  <w:style w:type="character" w:customStyle="1" w:styleId="HeaderChar">
+    <w:name w:val="Header Char"/>
+    <w:basedOn w:val="DefaultParagraphFont"/>
+    <w:link w:val="Header"/>
+    <w:uiPriority w:val="99"/>
+    <w:rsid w:val="0098673C"/>
+  </w:style>
+  <w:style w:type="paragraph" w:styleId="Footer">
+    <w:name w:val="footer"/>
+    <w:basedOn w:val="Normal"/>
+    <w:link w:val="FooterChar"/>
+    <w:uiPriority w:val="99"/>
+    <w:unhideWhenUsed/>
+    <w:rsid w:val="0098673C"/>
+    <w:pPr>
+      <w:tabs>
+        <w:tab w:val="center" w:pos="4680"/>
+        <w:tab w:val="right" w:pos="9360"/>
+      </w:tabs>
+      <w:spacing w:after="0" w:line="240" w:lineRule="auto"/>
+    </w:pPr>
+  </w:style>
+  <w:style w:type="character" w:customStyle="1" w:styleId="FooterChar">
+    <w:name w:val="Footer Char"/>
+    <w:basedOn w:val="DefaultParagraphFont"/>
+    <w:link w:val="Footer"/>
+    <w:uiPriority w:val="99"/>
+    <w:rsid w:val="0098673C"/>
+  </w:style>
 </w:styles>
 </file>
 

</xml_diff>